<commit_message>
Pathway 1 registry search, partner scouting and plan update; cloud daily watch (D-47); registry checks; ledger follow-ups; watch fixes
Co-Authored-By: Claude Opus 5.5 <noreply@anthropic.com>
Claude-Session: https://claude.ai/code/session_01R4fVsqxw3bVHnNA5eX8zAm
</commit_message>
<xml_diff>
--- a/usecases/scoring/pathways/pathway-1-plan.docx
+++ b/usecases/scoring/pathways/pathway-1-plan.docx
@@ -581,6 +581,254 @@
       </w:r>
     </w:p>
     <w:bookmarkEnd w:id="27"/>
+    <w:bookmarkStart w:id="31" w:name="X397b71f07929994290223f4360222ec31fc05af"/>
+    <w:p>
+      <w:pPr>
+        <w:pStyle w:val="Heading1"/>
+      </w:pPr>
+      <w:r>
+        <w:t xml:space="preserve">7. What already exists, and who to approach (added 2026-10-24)</w:t>
+      </w:r>
+    </w:p>
+    <w:p>
+      <w:pPr>
+        <w:pStyle w:val="FirstParagraph"/>
+      </w:pPr>
+      <w:r>
+        <w:t xml:space="preserve">Sources:</w:t>
+      </w:r>
+      <w:r>
+        <w:t xml:space="preserve"> </w:t>
+      </w:r>
+      <w:r>
+        <w:rPr>
+          <w:rStyle w:val="VerbatimChar"/>
+        </w:rPr>
+        <w:t xml:space="preserve">usecases/scoring/pathways/pathway-1-registry-search.md</w:t>
+      </w:r>
+      <w:r>
+        <w:t xml:space="preserve"> </w:t>
+      </w:r>
+      <w:r>
+        <w:t xml:space="preserve">(30 logged registry and literature look-ups) and</w:t>
+      </w:r>
+      <w:r>
+        <w:t xml:space="preserve"> </w:t>
+      </w:r>
+      <w:r>
+        <w:rPr>
+          <w:rStyle w:val="VerbatimChar"/>
+        </w:rPr>
+        <w:t xml:space="preserve">usecases/scoring/pathways/pathway-1-partners.md</w:t>
+      </w:r>
+      <w:r>
+        <w:t xml:space="preserve"> </w:t>
+      </w:r>
+      <w:r>
+        <w:t xml:space="preserve">(27 look-ups, public sources only, no personal contact data). Both are desk research; no organisation has been contacted, and willingness, capacity and fees are unknown.</w:t>
+      </w:r>
+    </w:p>
+    <w:bookmarkStart w:id="28" w:name="Xf632bc66c4fb82b431e506dea1527a4657b5000"/>
+    <w:p>
+      <w:pPr>
+        <w:pStyle w:val="Heading2"/>
+      </w:pPr>
+      <w:r>
+        <w:t xml:space="preserve">Does a trial already answer Step A or Step B?</w:t>
+      </w:r>
+    </w:p>
+    <w:p>
+      <w:pPr>
+        <w:pStyle w:val="FirstParagraph"/>
+      </w:pPr>
+      <w:r>
+        <w:t xml:space="preserve">No registered trial was found that answers either step, and no US record was found at all (WHO ICTRP results could not be read directly; abstracts only).</w:t>
+      </w:r>
+      <w:r>
+        <w:t xml:space="preserve"> </w:t>
+      </w:r>
+      <w:r>
+        <w:t xml:space="preserve">- Step A: no registered cross-platform C-peptide harmonisation study. Published laboratory work only: TaMADOR (PMID 38549041, DOI 10.1093/clinchem/hvae034), Deng 2023 (PMID 37141618, DOI 10.1515/cclm-2023-0215) and Hörber 2023 (PMID 36630986), all abstract level. No published US split-sample comparison at 80, 200 and 600 pmol/L.</w:t>
+      </w:r>
+      <w:r>
+        <w:t xml:space="preserve"> </w:t>
+      </w:r>
+      <w:r>
+        <w:t xml:space="preserve">- Step B: the closest design is CLASP (ISRCTN76893830, Dundee, UK), a single-arm pilot in 28 frail adults aged 70 or older with type 2 diabetes that withdraws insulin at random C-peptide of 900 pmol/L or more, with ketoacidosis and hyperosmolar state as secondary outcomes; no results found. Its cutoff is higher than this plan’s 600 pmol/L band, which is worth weighing when the step-down rule is set. Partly related, both UK: ARC-T1D (NCT06821360) and StartRight (PMID 36205650).</w:t>
+      </w:r>
+    </w:p>
+    <w:bookmarkEnd w:id="28"/>
+    <w:bookmarkStart w:id="29" w:name="X25442469a247b121440aaaaf44195bcee01b36d"/>
+    <w:p>
+      <w:pPr>
+        <w:pStyle w:val="Heading2"/>
+      </w:pPr>
+      <w:r>
+        <w:t xml:space="preserve">Candidate partners (ranked by fit; a judgement, not an endorsement)</w:t>
+      </w:r>
+    </w:p>
+    <w:p>
+      <w:pPr>
+        <w:numPr>
+          <w:ilvl w:val="0"/>
+          <w:numId w:val="1006"/>
+        </w:numPr>
+        <w:pStyle w:val="Compact"/>
+      </w:pPr>
+      <w:r>
+        <w:t xml:space="preserve">University of Missouri Diabetes Diagnostic Laboratory / C-peptide Standardization Program: the only US laboratory with a C-peptide reference measurement procedure on the international (JCTLM) register, plus commutable serum materials and multi-manufacturer studies (Rohlfing 2025, PMID 39803820, DOI 10.1515/cclm-2024-1260, full text). Step A reference values and materials.</w:t>
+      </w:r>
+    </w:p>
+    <w:p>
+      <w:pPr>
+        <w:numPr>
+          <w:ilvl w:val="0"/>
+          <w:numId w:val="1006"/>
+        </w:numPr>
+        <w:pStyle w:val="Compact"/>
+      </w:pPr>
+      <w:r>
+        <w:t xml:space="preserve">University of Washington (Hoofnagle laboratory, TaMADOR method): an independent LC-MS/MS method already compared with the Missouri procedure (PMIDs 34723236, 38549041). Second mass-spectrometry arm.</w:t>
+      </w:r>
+    </w:p>
+    <w:p>
+      <w:pPr>
+        <w:numPr>
+          <w:ilvl w:val="0"/>
+          <w:numId w:val="1006"/>
+        </w:numPr>
+        <w:pStyle w:val="Compact"/>
+      </w:pPr>
+      <w:r>
+        <w:t xml:space="preserve">Assay manufacturers, approached through the standardisation committee rather than one by one: Roche, Abbott, Siemens (Centaur and Atellica), DiaSorin and Tosoh have US-documented C-peptide products; Beckman, QuidelOrtho, Fujirebio, ALPCO and Mercodia need their US status checked. C-peptide assays are FDA Class I and exempt from 510(k) (21 CFR 862.1135), so FDA records cannot confirm which assays are on the US market; confirm from US labelling.</w:t>
+      </w:r>
+    </w:p>
+    <w:p>
+      <w:pPr>
+        <w:numPr>
+          <w:ilvl w:val="0"/>
+          <w:numId w:val="1006"/>
+        </w:numPr>
+        <w:pStyle w:val="Compact"/>
+      </w:pPr>
+      <w:r>
+        <w:t xml:space="preserve">RADIANT (rare and atypical diabetes network; PMIDs 37104866, 42892882): the closest population match for</w:t>
+      </w:r>
+      <w:r>
+        <w:t xml:space="preserve"> </w:t>
+      </w:r>
+      <w:r>
+        <w:t xml:space="preserve">“</w:t>
+      </w:r>
+      <w:r>
+        <w:t xml:space="preserve">insulin-treated, type uncertain</w:t>
+      </w:r>
+      <w:r>
+        <w:t xml:space="preserve">”</w:t>
+      </w:r>
+      <w:r>
+        <w:t xml:space="preserve">; an ancillary study is likely more feasible than a separate network. Step B.</w:t>
+      </w:r>
+    </w:p>
+    <w:p>
+      <w:pPr>
+        <w:numPr>
+          <w:ilvl w:val="0"/>
+          <w:numId w:val="1006"/>
+        </w:numPr>
+        <w:pStyle w:val="Compact"/>
+      </w:pPr>
+      <w:r>
+        <w:t xml:space="preserve">T1D Exchange Quality Improvement network: adult clinics and a shared data platform for the stepped-wedge design, but a T1D-labelled, mostly paediatric population. Step B arm for</w:t>
+      </w:r>
+      <w:r>
+        <w:t xml:space="preserve"> </w:t>
+      </w:r>
+      <w:r>
+        <w:t xml:space="preserve">“</w:t>
+      </w:r>
+      <w:r>
+        <w:t xml:space="preserve">T1D label with BMI 30 or more, or diagnosis at 35 or older</w:t>
+      </w:r>
+      <w:r>
+        <w:t xml:space="preserve">”</w:t>
+      </w:r>
+      <w:r>
+        <w:t xml:space="preserve">.</w:t>
+      </w:r>
+    </w:p>
+    <w:p>
+      <w:pPr>
+        <w:numPr>
+          <w:ilvl w:val="0"/>
+          <w:numId w:val="1006"/>
+        </w:numPr>
+        <w:pStyle w:val="Compact"/>
+      </w:pPr>
+      <w:r>
+        <w:t xml:space="preserve">College of American Pathologists accuracy-based survey: if it still runs, a low-cost baseline of US platform bias against reference values (status unverified).</w:t>
+      </w:r>
+    </w:p>
+    <w:p>
+      <w:pPr>
+        <w:numPr>
+          <w:ilvl w:val="0"/>
+          <w:numId w:val="1006"/>
+        </w:numPr>
+        <w:pStyle w:val="Compact"/>
+      </w:pPr>
+      <w:r>
+        <w:t xml:space="preserve">Single academic centres (Johns Hopkins, Indiana, Penn, Chicago) as founding Step B sites or protocol co-authors.</w:t>
+      </w:r>
+    </w:p>
+    <w:bookmarkEnd w:id="29"/>
+    <w:bookmarkStart w:id="30" w:name="new-gaps-for-step-a"/>
+    <w:p>
+      <w:pPr>
+        <w:pStyle w:val="Heading2"/>
+      </w:pPr>
+      <w:r>
+        <w:t xml:space="preserve">New gaps for Step A</w:t>
+      </w:r>
+    </w:p>
+    <w:p>
+      <w:pPr>
+        <w:numPr>
+          <w:ilvl w:val="0"/>
+          <w:numId w:val="1007"/>
+        </w:numPr>
+        <w:pStyle w:val="Compact"/>
+      </w:pPr>
+      <w:r>
+        <w:t xml:space="preserve">Within-person biological variation, reference change value and repeatability of random C-peptide in insulin-treated adults were not covered by any source found; allowable bias cannot be set without them.</w:t>
+      </w:r>
+    </w:p>
+    <w:p>
+      <w:pPr>
+        <w:numPr>
+          <w:ilvl w:val="0"/>
+          <w:numId w:val="1007"/>
+        </w:numPr>
+        <w:pStyle w:val="Compact"/>
+      </w:pPr>
+      <w:r>
+        <w:t xml:space="preserve">Sample stability and pre-analytical handling need their own validation (flagged, not quantified, in Rohlfing 2025).</w:t>
+      </w:r>
+    </w:p>
+    <w:p>
+      <w:pPr>
+        <w:numPr>
+          <w:ilvl w:val="0"/>
+          <w:numId w:val="1007"/>
+        </w:numPr>
+        <w:pStyle w:val="Compact"/>
+      </w:pPr>
+      <w:r>
+        <w:t xml:space="preserve">No CDC or NIST C-peptide programme was found.</w:t>
+      </w:r>
+    </w:p>
+    <w:bookmarkEnd w:id="30"/>
+    <w:bookmarkEnd w:id="31"/>
     <w:sectPr/>
   </w:body>
 </w:document>
@@ -757,6 +1005,91 @@
     <w:lvl w:ilvl="8">
       <w:numFmt w:val="bullet"/>
       <w:lvlText w:val="•"/>
+      <w:lvlJc w:val="left"/>
+      <w:pPr>
+        <w:ind w:left="6480" w:hanging="480"/>
+      </w:pPr>
+    </w:lvl>
+  </w:abstractNum>
+  <w:abstractNum w:abstractNumId="99411">
+    <w:nsid w:val="A99411"/>
+    <w:multiLevelType w:val="multilevel"/>
+    <w:lvl w:ilvl="0">
+      <w:start w:val="1"/>
+      <w:numFmt w:val="decimal"/>
+      <w:lvlText w:val="%1."/>
+      <w:lvlJc w:val="left"/>
+      <w:pPr>
+        <w:ind w:left="720" w:hanging="480"/>
+      </w:pPr>
+    </w:lvl>
+    <w:lvl w:ilvl="1">
+      <w:start w:val="1"/>
+      <w:numFmt w:val="decimal"/>
+      <w:lvlText w:val="%2."/>
+      <w:lvlJc w:val="left"/>
+      <w:pPr>
+        <w:ind w:left="1440" w:hanging="480"/>
+      </w:pPr>
+    </w:lvl>
+    <w:lvl w:ilvl="2">
+      <w:start w:val="1"/>
+      <w:numFmt w:val="decimal"/>
+      <w:lvlText w:val="%3."/>
+      <w:lvlJc w:val="left"/>
+      <w:pPr>
+        <w:ind w:left="2160" w:hanging="480"/>
+      </w:pPr>
+    </w:lvl>
+    <w:lvl w:ilvl="3">
+      <w:start w:val="1"/>
+      <w:numFmt w:val="decimal"/>
+      <w:lvlText w:val="%4."/>
+      <w:lvlJc w:val="left"/>
+      <w:pPr>
+        <w:ind w:left="2880" w:hanging="480"/>
+      </w:pPr>
+    </w:lvl>
+    <w:lvl w:ilvl="4">
+      <w:start w:val="1"/>
+      <w:numFmt w:val="decimal"/>
+      <w:lvlText w:val="%5."/>
+      <w:lvlJc w:val="left"/>
+      <w:pPr>
+        <w:ind w:left="3600" w:hanging="480"/>
+      </w:pPr>
+    </w:lvl>
+    <w:lvl w:ilvl="5">
+      <w:start w:val="1"/>
+      <w:numFmt w:val="decimal"/>
+      <w:lvlText w:val="%6."/>
+      <w:lvlJc w:val="left"/>
+      <w:pPr>
+        <w:ind w:left="4320" w:hanging="480"/>
+      </w:pPr>
+    </w:lvl>
+    <w:lvl w:ilvl="6">
+      <w:start w:val="1"/>
+      <w:numFmt w:val="decimal"/>
+      <w:lvlText w:val="%7."/>
+      <w:lvlJc w:val="left"/>
+      <w:pPr>
+        <w:ind w:left="5040" w:hanging="480"/>
+      </w:pPr>
+    </w:lvl>
+    <w:lvl w:ilvl="7">
+      <w:start w:val="1"/>
+      <w:numFmt w:val="decimal"/>
+      <w:lvlText w:val="%8."/>
+      <w:lvlJc w:val="left"/>
+      <w:pPr>
+        <w:ind w:left="5760" w:hanging="480"/>
+      </w:pPr>
+    </w:lvl>
+    <w:lvl w:ilvl="8">
+      <w:start w:val="1"/>
+      <w:numFmt w:val="decimal"/>
+      <w:lvlText w:val="%9."/>
       <w:lvlJc w:val="left"/>
       <w:pPr>
         <w:ind w:left="6480" w:hanging="480"/>
@@ -779,6 +1112,39 @@
     <w:abstractNumId w:val="991"/>
   </w:num>
   <w:num w:numId="1005">
+    <w:abstractNumId w:val="991"/>
+  </w:num>
+  <w:num w:numId="1006">
+    <w:abstractNumId w:val="99411"/>
+    <w:lvlOverride w:ilvl="0">
+      <w:startOverride w:val="1"/>
+    </w:lvlOverride>
+    <w:lvlOverride w:ilvl="1">
+      <w:startOverride w:val="1"/>
+    </w:lvlOverride>
+    <w:lvlOverride w:ilvl="2">
+      <w:startOverride w:val="1"/>
+    </w:lvlOverride>
+    <w:lvlOverride w:ilvl="3">
+      <w:startOverride w:val="1"/>
+    </w:lvlOverride>
+    <w:lvlOverride w:ilvl="4">
+      <w:startOverride w:val="1"/>
+    </w:lvlOverride>
+    <w:lvlOverride w:ilvl="5">
+      <w:startOverride w:val="1"/>
+    </w:lvlOverride>
+    <w:lvlOverride w:ilvl="6">
+      <w:startOverride w:val="1"/>
+    </w:lvlOverride>
+    <w:lvlOverride w:ilvl="7">
+      <w:startOverride w:val="1"/>
+    </w:lvlOverride>
+    <w:lvlOverride w:ilvl="8">
+      <w:startOverride w:val="1"/>
+    </w:lvlOverride>
+  </w:num>
+  <w:num w:numId="1007">
     <w:abstractNumId w:val="991"/>
   </w:num>
 </w:numbering>

</xml_diff>

<commit_message>
Step A gap search: C-peptide variation, assay bias and stability; plan section 7 updated
Co-Authored-By: Claude Opus 5.5 <noreply@anthropic.com>
Claude-Session: https://claude.ai/code/session_01R4fVsqxw3bVHnNA5eX8zAm
</commit_message>
<xml_diff>
--- a/usecases/scoring/pathways/pathway-1-plan.docx
+++ b/usecases/scoring/pathways/pathway-1-plan.docx
@@ -800,7 +800,43 @@
         <w:pStyle w:val="Compact"/>
       </w:pPr>
       <w:r>
-        <w:t xml:space="preserve">Within-person biological variation, reference change value and repeatability of random C-peptide in insulin-treated adults were not covered by any source found; allowable bias cannot be set without them.</w:t>
+        <w:t xml:space="preserve">Biological variation (gap search 2026-10-24,</w:t>
+      </w:r>
+      <w:r>
+        <w:t xml:space="preserve"> </w:t>
+      </w:r>
+      <w:r>
+        <w:rPr>
+          <w:rStyle w:val="VerbatimChar"/>
+        </w:rPr>
+        <w:t xml:space="preserve">usecases/scoring/pathways/pathway-1-cpeptide-variation.md</w:t>
+      </w:r>
+      <w:r>
+        <w:t xml:space="preserve">, 24 logged look-ups): no study gives within-person variation of random C-peptide in insulin-treated adults or anyone with diabetes. Published within-person CVs (about 9% to 28%) come from healthy, mostly fasting people on older assays; the EFLM database has no meta-analysed value; the nearest diabetes figures are fasting 38% and post-meal 27% in type 2 diabetes (Bowman 2012, abstract only). Step A (or a small add-on) therefore has to measure repeat random C-peptide in insulin-treated adults itself.</w:t>
+      </w:r>
+    </w:p>
+    <w:p>
+      <w:pPr>
+        <w:numPr>
+          <w:ilvl w:val="0"/>
+          <w:numId w:val="1007"/>
+        </w:numPr>
+        <w:pStyle w:val="Compact"/>
+      </w:pPr>
+      <w:r>
+        <w:t xml:space="preserve">Assay performance: within-laboratory CV about 1.4% to 10%; bias between methods about 20% to 52%. The only published specification is the Ricós/Westgard 2014 table (desirable bias 7.1%, total error 20.8%), which corresponds to roughly 6, 14 and 43 pmol/L at 80, 200 and 600 pmol/L (a derivation, not a finding). Measured inter-method bias is 3 to 7 times larger, which is the case for Step A.</w:t>
+      </w:r>
+    </w:p>
+    <w:p>
+      <w:pPr>
+        <w:numPr>
+          <w:ilvl w:val="0"/>
+          <w:numId w:val="1007"/>
+        </w:numPr>
+        <w:pStyle w:val="Compact"/>
+      </w:pPr>
+      <w:r>
+        <w:t xml:space="preserve">Sample handling: C-peptide in EDTA whole blood was reported stable for 24 hours at room temperature, while unspun serum lost 22% to 74%; Step A should standardise on EDTA plasma with stated handling times.</w:t>
       </w:r>
     </w:p>
     <w:p>

</xml_diff>